<commit_message>
Remove duplicate question from 詩經 question bank
Co-Authored-By: Claude Opus 5.5 <noreply@anthropic.com>
Claude-Session: https://claude.ai/code/session_01VjAtK9H2NrhudzeuTgqHVu
</commit_message>
<xml_diff>
--- a/output/詩經題庫.docx
+++ b/output/詩經題庫.docx
@@ -972,54 +972,6 @@
     </w:p>
     <w:p>
       <w:r>
-        <w:rPr>
-          <w:b/>
-        </w:rPr>
-        <w:t>21. 有關《詩經》，以下何者正確？</w:t>
-      </w:r>
-    </w:p>
-    <w:p>
-      <w:pPr>
-        <w:ind w:left="360"/>
-      </w:pPr>
-      <w:r>
-        <w:t>(A) 作法：風、雅、頌</w:t>
-      </w:r>
-    </w:p>
-    <w:p>
-      <w:pPr>
-        <w:ind w:left="360"/>
-      </w:pPr>
-      <w:r>
-        <w:t>(B) 體裁：賦、比、興</w:t>
-      </w:r>
-    </w:p>
-    <w:p>
-      <w:pPr>
-        <w:ind w:left="360"/>
-      </w:pPr>
-      <w:r>
-        <w:t>(C) 作者大多為戰國時代的人</w:t>
-      </w:r>
-    </w:p>
-    <w:p>
-      <w:pPr>
-        <w:ind w:left="360"/>
-      </w:pPr>
-      <w:r>
-        <w:t>(D) 頌分周頌、魯頌、商頌</w:t>
-      </w:r>
-    </w:p>
-    <w:p>
-      <w:r>
-        <w:rPr>
-          <w:b/>
-        </w:rPr>
-        <w:t>答案：D</w:t>
-      </w:r>
-    </w:p>
-    <w:p>
-      <w:r>
         <w:br w:type="page"/>
       </w:r>
     </w:p>
@@ -1503,28 +1455,6 @@
           </w:p>
         </w:tc>
       </w:tr>
-      <w:tr>
-        <w:tc>
-          <w:tcPr>
-            <w:tcW w:type="dxa" w:w="4320"/>
-          </w:tcPr>
-          <w:p>
-            <w:r>
-              <w:t>21</w:t>
-            </w:r>
-          </w:p>
-        </w:tc>
-        <w:tc>
-          <w:tcPr>
-            <w:tcW w:type="dxa" w:w="4320"/>
-          </w:tcPr>
-          <w:p>
-            <w:r>
-              <w:t>D</w:t>
-            </w:r>
-          </w:p>
-        </w:tc>
-      </w:tr>
     </w:tbl>
     <w:sectPr>
       <w:pgSz w:w="12240" w:h="15840"/>

</xml_diff>